<commit_message>
docs: bring the docs/ deliverables to v2.0, as built (T150)
The deliverables still described the August v1.0 plan: a four-person team over three releases,
an auto-remediation engine, Claude on classic Bedrock Agents, NL Q&A, a notification bell and
separate dev and prod accounts. Each is rewritten in place to the system as built, from clones of
its own styles so layout and branding are unchanged: the Capstone Overview (doc and deck, plus a
"Where It Stands" slide), the Architecture deck, the Plan & Tech Stack Guide (decisions as
built, components, security, AI, how it was delivered, how the risks played out), the
Engineering Guide (layout, 16 CI checks, deploy and teardown, the real connector contract,
runbooks from the live run), and the Backlog (each story's outcome and spec, plus an as-built
summary with live formulas). The original draft plan is unchanged; v1.0 stays in git history.

Co-Authored-By: Claude Opus 5.5 <noreply@anthropic.com>
</commit_message>
<xml_diff>
--- a/docs/CloudPulse-AI_Capstone-Overview.docx
+++ b/docs/CloudPulse-AI_Capstone-Overview.docx
@@ -45,7 +45,7 @@
           <w:sz w:val="22"/>
           <w:szCs w:val="22"/>
         </w:rPr>
-        <w:t xml:space="preserve">Intelligent Cloud Governance, Cost &amp; Compliance Platform  •  Capstone Project Overview</w:t>
+        <w:t xml:space="preserve">AWS-Native Cloud Governance, Cost &amp; Compliance Platform  •  Capstone Project Overview  •  v2.0, as built (October 2026)</w:t>
       </w:r>
     </w:p>
     <w:p>
@@ -72,7 +72,7 @@
         <w:t xml:space="preserve">CloudPulse AI</w:t>
       </w:r>
       <w:r>
-        <w:t xml:space="preserve"> — Intelligent Cloud Governance, Cost &amp; Compliance Platform for AWS.</w:t>
+        <w:t xml:space="preserve"> — AWS-native cloud governance, cost and compliance platform with grounded AI insights.</w:t>
       </w:r>
     </w:p>
     <w:p>
@@ -92,11 +92,7 @@
         <w:spacing w:after="140" w:line="300"/>
       </w:pPr>
       <w:r>
-        <w:rPr>
-          <w:i/>
-          <w:iCs/>
-        </w:rPr>
-        <w:t xml:space="preserve">“Your cloud, accounted for.” — every resource discovered, owned, compliant, and cost-justified.</w:t>
+        <w:t xml:space="preserve">“Your cloud, accounted for.” — every resource discovered, owned, checked for compliance, and visible in cost.</w:t>
       </w:r>
     </w:p>
     <w:p>
@@ -116,23 +112,23 @@
         <w:spacing w:after="140" w:line="300"/>
       </w:pPr>
       <w:r>
-        <w:t xml:space="preserve">CloudPulse AI is a serverless, AI-assisted cloud governance platform that gives an organization a single pane of glass over its AWS estate. It automatically discovers resources across accounts and regions, validates them against organizational tagging standards, identifies who owns each resource by mining CloudTrail activity, and maps every resource to the internal project (SDA — Software Development Accelerator) it belongs to. It then closes the loop: owners are notified and escalated on a defined cadence until issues are fixed, and safe findings such as missing tags are remediated automatically with a full audit trail.</w:t>
-      </w:r>
-    </w:p>
-    <w:p>
-      <w:pPr>
-        <w:spacing w:after="140" w:line="300"/>
-      </w:pPr>
-      <w:r>
-        <w:t xml:space="preserve">On top of this governance core, CloudPulse AI layers cost intelligence — per-project budgets, overrun detection, unused-resource and rightsizing recommendations — and a GenAI layer built on Amazon Bedrock that turns raw findings into plain-language insights, remediation suggestions, and natural-language Q&amp;A over the cloud inventory.</w:t>
-      </w:r>
-    </w:p>
-    <w:p>
-      <w:pPr>
-        <w:spacing w:after="140" w:line="300"/>
-      </w:pPr>
-      <w:r>
-        <w:t xml:space="preserve">The platform itself is built entirely on AWS serverless services (Lambda, Step Functions, API Gateway, Aurora Serverless v2, EventBridge, SES) with a Python/FastAPI backend and an Angular dashboard. A provider-agnostic connector design means Azure and other clouds can be added later without re-architecting, and a roles-only access model means the platform stores no credentials at all.</w:t>
+        <w:t xml:space="preserve">CloudPulse AI is a serverless, AI-assisted cloud governance platform that gives an organization one place to see its AWS estate. It discovers every resource across connected accounts and regions — tagged or not — evaluates each one against tagging rules stored as data, traces each resource to the person who created it using CloudTrail, and maps resources to the internal projects (SDAs — Software Development Accelerators) they belong to. Every violation becomes a tracked finding with a lifecycle, every account gets a compliance score, and owners are emailed on a day-0/2/4 cadence until findings are resolved, then escalated.</w:t>
+      </w:r>
+    </w:p>
+    <w:p>
+      <w:pPr>
+        <w:spacing w:after="140" w:line="300"/>
+      </w:pPr>
+      <w:r>
+        <w:t xml:space="preserve">On top of this governance core, CloudPulse AI adds cost intelligence — daily spend from Cost Explorer, per-SDA budgets with overrun findings, idle-resource detection, IAM hygiene, forecasts and rightsizing — and an AI layer on Amazon Bedrock AgentCore with Amazon Nova 2 Lite that writes a daily plain-language digest and a remediation suggestion for each finding. Every AI output is checked against platform data by a deterministic validator before anyone sees it: no invented resources, no invented numbers.</w:t>
+      </w:r>
+    </w:p>
+    <w:p>
+      <w:pPr>
+        <w:spacing w:after="140" w:line="300"/>
+      </w:pPr>
+      <w:r>
+        <w:t xml:space="preserve">The platform runs entirely on AWS managed services (Lambda, Step Functions, API Gateway, Aurora Serverless v2, SQS, EventBridge Scheduler, Cognito, SES, Bedrock AgentCore) with a Python/FastAPI backend and an Angular 18 dashboard, all defined in Terraform and delivered through GitHub Actions with OIDC. It reads accounts and never changes them: scanning is read-only, AI agents cannot execute changes or hold credentials, and the platform stores no access keys anywhere.</w:t>
       </w:r>
     </w:p>
     <w:p>
@@ -220,7 +216,7 @@
         <w:spacing w:after="140" w:line="300"/>
       </w:pPr>
       <w:r>
-        <w:t xml:space="preserve">Native cloud tools expose the raw data but do not close the loop: they do not attribute ownership, do not chase owners to fix issues, and do not act.</w:t>
+        <w:t xml:space="preserve">Native cloud tools expose the raw data but do not close the loop: they do not attribute ownership, do not chase owners to fix issues, and do not explain what matters today.</w:t>
       </w:r>
     </w:p>
     <w:p>
@@ -249,10 +245,10 @@
           <w:b/>
           <w:bCs/>
         </w:rPr>
-        <w:t xml:space="preserve">Continuous visibility: </w:t>
-      </w:r>
-      <w:r>
-        <w:t xml:space="preserve">automated multi-region, multi-account inventory replaces manual console checks — the estate is known at all times.</w:t>
+        <w:t xml:space="preserve">Continuous visibility:</w:t>
+      </w:r>
+      <w:r>
+        <w:t xml:space="preserve"> a whole-account inventory across accounts and regions, refreshed daily and on demand, replaces manual console checks.</w:t>
       </w:r>
     </w:p>
     <w:p>
@@ -269,10 +265,10 @@
           <w:b/>
           <w:bCs/>
         </w:rPr>
-        <w:t xml:space="preserve">Enforced accountability: </w:t>
-      </w:r>
-      <w:r>
-        <w:t xml:space="preserve">every resource gets an owner — from tags, CloudTrail forensics, or a managed triage queue — and owners are automatically notified and escalated until findings are resolved.</w:t>
+        <w:t xml:space="preserve">Enforced accountability:</w:t>
+      </w:r>
+      <w:r>
+        <w:t xml:space="preserve"> every resource is traced to an owner — from CloudTrail creation events, with a fallback chain — and owners are emailed and escalated until findings are resolved.</w:t>
       </w:r>
     </w:p>
     <w:p>
@@ -289,10 +285,10 @@
           <w:b/>
           <w:bCs/>
         </w:rPr>
-        <w:t xml:space="preserve">Financial control: </w:t>
-      </w:r>
-      <w:r>
-        <w:t xml:space="preserve">project-level budgets, overrun alerts, and concrete savings recommendations surface problems before the bill does.</w:t>
+        <w:t xml:space="preserve">Financial control:</w:t>
+      </w:r>
+      <w:r>
+        <w:t xml:space="preserve"> daily spend, per-SDA budgets with overrun findings, idle-resource detection and rightsizing surface problems before the bill does.</w:t>
       </w:r>
     </w:p>
     <w:p>
@@ -309,10 +305,10 @@
           <w:b/>
           <w:bCs/>
         </w:rPr>
-        <w:t xml:space="preserve">Reduced toil: </w:t>
-      </w:r>
-      <w:r>
-        <w:t xml:space="preserve">safe auto-remediation and AI-generated insights replace hours of manual reporting and follow-up.</w:t>
+        <w:t xml:space="preserve">Less toil, grounded AI:</w:t>
+      </w:r>
+      <w:r>
+        <w:t xml:space="preserve"> a daily digest and a remediation suggestion per finding replace manual reporting — each validated against platform data, with people making every change.</w:t>
       </w:r>
     </w:p>
     <w:p>
@@ -324,10 +320,94 @@
           <w:b/>
           <w:bCs/>
         </w:rPr>
-        <w:t xml:space="preserve">Measurable outcomes targeted: </w:t>
-      </w:r>
-      <w:r>
-        <w:t xml:space="preserve">tag-compliance percentage up, mean time-to-remediate findings down, and monthly spend on unused resources identified and recovered.</w:t>
+        <w:t xml:space="preserve">Measurable outcomes targeted:</w:t>
+      </w:r>
+      <w:r>
+        <w:t xml:space="preserve"> tag-compliance percentage up, mean time-to-resolve findings down, and spend on idle resources identified.</w:t>
+      </w:r>
+    </w:p>
+    <w:p>
+      <w:pPr>
+        <w:pStyle w:val="Heading1"/>
+        <w:spacing w:after="160" w:before="360"/>
+      </w:pPr>
+      <w:r>
+        <w:rPr>
+          <w:color w:val="16213E"/>
+        </w:rPr>
+        <w:t xml:space="preserve">How It Was Built</w:t>
+      </w:r>
+    </w:p>
+    <w:p>
+      <w:pPr>
+        <w:spacing w:after="140" w:line="300"/>
+      </w:pPr>
+      <w:r>
+        <w:t xml:space="preserve">One maintainer, working with Claude Code under GitHub Spec Kit: a constitution of eight principles, six feature specs taken from specification through plan and tasks, 481 tasks implemented on short-lived branches and merged through 149 pull requests behind 16 required CI checks — including a recorded AI constitution review on every pull request.</w:t>
+      </w:r>
+    </w:p>
+    <w:p>
+      <w:pPr>
+        <w:pStyle w:val="Heading1"/>
+        <w:spacing w:after="160" w:before="360"/>
+      </w:pPr>
+      <w:r>
+        <w:rPr>
+          <w:color w:val="16213E"/>
+        </w:rPr>
+        <w:t xml:space="preserve">Status (October 2026)</w:t>
+      </w:r>
+    </w:p>
+    <w:p>
+      <w:pPr>
+        <w:pStyle w:val="ListParagraph"/>
+        <w:numPr>
+          <w:ilvl w:val="0"/>
+          <w:numId w:val="2"/>
+        </w:numPr>
+        <w:spacing w:after="80" w:line="280"/>
+      </w:pPr>
+      <w:r>
+        <w:t xml:space="preserve">All six specs implemented; 481 of 481 tasks closed.</w:t>
+      </w:r>
+    </w:p>
+    <w:p>
+      <w:pPr>
+        <w:pStyle w:val="ListParagraph"/>
+        <w:numPr>
+          <w:ilvl w:val="0"/>
+          <w:numId w:val="2"/>
+        </w:numPr>
+        <w:spacing w:after="80" w:line="280"/>
+      </w:pPr>
+      <w:r>
+        <w:t xml:space="preserve">Live-verified end to end on a real AWS account: registration, a whole-account scan (87 resources), compliance scoring, CloudTrail ownership, the dashboard, the AI digest and suggestions through Nova, and cost ingestion — three bugs were found live and fixed.</w:t>
+      </w:r>
+    </w:p>
+    <w:p>
+      <w:pPr>
+        <w:pStyle w:val="ListParagraph"/>
+        <w:numPr>
+          <w:ilvl w:val="0"/>
+          <w:numId w:val="2"/>
+        </w:numPr>
+        <w:spacing w:after="80" w:line="280"/>
+      </w:pPr>
+      <w:r>
+        <w:t xml:space="preserve">Not yet live-verified: owner email (needs a verified SES sender) and cross-account onboarding (needs a second AWS account).</w:t>
+      </w:r>
+    </w:p>
+    <w:p>
+      <w:pPr>
+        <w:pStyle w:val="ListParagraph"/>
+        <w:numPr>
+          <w:ilvl w:val="0"/>
+          <w:numId w:val="2"/>
+        </w:numPr>
+        <w:spacing w:after="80" w:line="280"/>
+      </w:pPr>
+      <w:r>
+        <w:t xml:space="preserve">One environment, deployed for a working session and torn down to zero cost afterwards.</w:t>
       </w:r>
     </w:p>
     <w:sectPr>

</xml_diff>

<commit_message>
docs: bring the docs/ deliverables to v2.0, as built (T150) (#165)
The deliverables still described the August v1.0 plan: a four-person team over three releases,
an auto-remediation engine, Claude on classic Bedrock Agents, NL Q&A, a notification bell and
separate dev and prod accounts. Each is rewritten in place to the system as built, from clones of
its own styles so layout and branding are unchanged: the Capstone Overview (doc and deck, plus a
"Where It Stands" slide), the Architecture deck, the Plan & Tech Stack Guide (decisions as
built, components, security, AI, how it was delivered, how the risks played out), the
Engineering Guide (layout, 16 CI checks, deploy and teardown, the real connector contract,
runbooks from the live run), and the Backlog (each story's outcome and spec, plus an as-built
summary with live formulas). The original draft plan is unchanged; v1.0 stays in git history.

Co-authored-by: Claude Opus 5.5 <noreply@anthropic.com>
</commit_message>
<xml_diff>
--- a/docs/CloudPulse-AI_Capstone-Overview.docx
+++ b/docs/CloudPulse-AI_Capstone-Overview.docx
@@ -45,7 +45,7 @@
           <w:sz w:val="22"/>
           <w:szCs w:val="22"/>
         </w:rPr>
-        <w:t xml:space="preserve">Intelligent Cloud Governance, Cost &amp; Compliance Platform  •  Capstone Project Overview</w:t>
+        <w:t xml:space="preserve">AWS-Native Cloud Governance, Cost &amp; Compliance Platform  •  Capstone Project Overview  •  v2.0, as built (October 2026)</w:t>
       </w:r>
     </w:p>
     <w:p>
@@ -72,7 +72,7 @@
         <w:t xml:space="preserve">CloudPulse AI</w:t>
       </w:r>
       <w:r>
-        <w:t xml:space="preserve"> — Intelligent Cloud Governance, Cost &amp; Compliance Platform for AWS.</w:t>
+        <w:t xml:space="preserve"> — AWS-native cloud governance, cost and compliance platform with grounded AI insights.</w:t>
       </w:r>
     </w:p>
     <w:p>
@@ -92,11 +92,7 @@
         <w:spacing w:after="140" w:line="300"/>
       </w:pPr>
       <w:r>
-        <w:rPr>
-          <w:i/>
-          <w:iCs/>
-        </w:rPr>
-        <w:t xml:space="preserve">“Your cloud, accounted for.” — every resource discovered, owned, compliant, and cost-justified.</w:t>
+        <w:t xml:space="preserve">“Your cloud, accounted for.” — every resource discovered, owned, checked for compliance, and visible in cost.</w:t>
       </w:r>
     </w:p>
     <w:p>
@@ -116,23 +112,23 @@
         <w:spacing w:after="140" w:line="300"/>
       </w:pPr>
       <w:r>
-        <w:t xml:space="preserve">CloudPulse AI is a serverless, AI-assisted cloud governance platform that gives an organization a single pane of glass over its AWS estate. It automatically discovers resources across accounts and regions, validates them against organizational tagging standards, identifies who owns each resource by mining CloudTrail activity, and maps every resource to the internal project (SDA — Software Development Accelerator) it belongs to. It then closes the loop: owners are notified and escalated on a defined cadence until issues are fixed, and safe findings such as missing tags are remediated automatically with a full audit trail.</w:t>
-      </w:r>
-    </w:p>
-    <w:p>
-      <w:pPr>
-        <w:spacing w:after="140" w:line="300"/>
-      </w:pPr>
-      <w:r>
-        <w:t xml:space="preserve">On top of this governance core, CloudPulse AI layers cost intelligence — per-project budgets, overrun detection, unused-resource and rightsizing recommendations — and a GenAI layer built on Amazon Bedrock that turns raw findings into plain-language insights, remediation suggestions, and natural-language Q&amp;A over the cloud inventory.</w:t>
-      </w:r>
-    </w:p>
-    <w:p>
-      <w:pPr>
-        <w:spacing w:after="140" w:line="300"/>
-      </w:pPr>
-      <w:r>
-        <w:t xml:space="preserve">The platform itself is built entirely on AWS serverless services (Lambda, Step Functions, API Gateway, Aurora Serverless v2, EventBridge, SES) with a Python/FastAPI backend and an Angular dashboard. A provider-agnostic connector design means Azure and other clouds can be added later without re-architecting, and a roles-only access model means the platform stores no credentials at all.</w:t>
+        <w:t xml:space="preserve">CloudPulse AI is a serverless, AI-assisted cloud governance platform that gives an organization one place to see its AWS estate. It discovers every resource across connected accounts and regions — tagged or not — evaluates each one against tagging rules stored as data, traces each resource to the person who created it using CloudTrail, and maps resources to the internal projects (SDAs — Software Development Accelerators) they belong to. Every violation becomes a tracked finding with a lifecycle, every account gets a compliance score, and owners are emailed on a day-0/2/4 cadence until findings are resolved, then escalated.</w:t>
+      </w:r>
+    </w:p>
+    <w:p>
+      <w:pPr>
+        <w:spacing w:after="140" w:line="300"/>
+      </w:pPr>
+      <w:r>
+        <w:t xml:space="preserve">On top of this governance core, CloudPulse AI adds cost intelligence — daily spend from Cost Explorer, per-SDA budgets with overrun findings, idle-resource detection, IAM hygiene, forecasts and rightsizing — and an AI layer on Amazon Bedrock AgentCore with Amazon Nova 2 Lite that writes a daily plain-language digest and a remediation suggestion for each finding. Every AI output is checked against platform data by a deterministic validator before anyone sees it: no invented resources, no invented numbers.</w:t>
+      </w:r>
+    </w:p>
+    <w:p>
+      <w:pPr>
+        <w:spacing w:after="140" w:line="300"/>
+      </w:pPr>
+      <w:r>
+        <w:t xml:space="preserve">The platform runs entirely on AWS managed services (Lambda, Step Functions, API Gateway, Aurora Serverless v2, SQS, EventBridge Scheduler, Cognito, SES, Bedrock AgentCore) with a Python/FastAPI backend and an Angular 18 dashboard, all defined in Terraform and delivered through GitHub Actions with OIDC. It reads accounts and never changes them: scanning is read-only, AI agents cannot execute changes or hold credentials, and the platform stores no access keys anywhere.</w:t>
       </w:r>
     </w:p>
     <w:p>
@@ -220,7 +216,7 @@
         <w:spacing w:after="140" w:line="300"/>
       </w:pPr>
       <w:r>
-        <w:t xml:space="preserve">Native cloud tools expose the raw data but do not close the loop: they do not attribute ownership, do not chase owners to fix issues, and do not act.</w:t>
+        <w:t xml:space="preserve">Native cloud tools expose the raw data but do not close the loop: they do not attribute ownership, do not chase owners to fix issues, and do not explain what matters today.</w:t>
       </w:r>
     </w:p>
     <w:p>
@@ -249,10 +245,10 @@
           <w:b/>
           <w:bCs/>
         </w:rPr>
-        <w:t xml:space="preserve">Continuous visibility: </w:t>
-      </w:r>
-      <w:r>
-        <w:t xml:space="preserve">automated multi-region, multi-account inventory replaces manual console checks — the estate is known at all times.</w:t>
+        <w:t xml:space="preserve">Continuous visibility:</w:t>
+      </w:r>
+      <w:r>
+        <w:t xml:space="preserve"> a whole-account inventory across accounts and regions, refreshed daily and on demand, replaces manual console checks.</w:t>
       </w:r>
     </w:p>
     <w:p>
@@ -269,10 +265,10 @@
           <w:b/>
           <w:bCs/>
         </w:rPr>
-        <w:t xml:space="preserve">Enforced accountability: </w:t>
-      </w:r>
-      <w:r>
-        <w:t xml:space="preserve">every resource gets an owner — from tags, CloudTrail forensics, or a managed triage queue — and owners are automatically notified and escalated until findings are resolved.</w:t>
+        <w:t xml:space="preserve">Enforced accountability:</w:t>
+      </w:r>
+      <w:r>
+        <w:t xml:space="preserve"> every resource is traced to an owner — from CloudTrail creation events, with a fallback chain — and owners are emailed and escalated until findings are resolved.</w:t>
       </w:r>
     </w:p>
     <w:p>
@@ -289,10 +285,10 @@
           <w:b/>
           <w:bCs/>
         </w:rPr>
-        <w:t xml:space="preserve">Financial control: </w:t>
-      </w:r>
-      <w:r>
-        <w:t xml:space="preserve">project-level budgets, overrun alerts, and concrete savings recommendations surface problems before the bill does.</w:t>
+        <w:t xml:space="preserve">Financial control:</w:t>
+      </w:r>
+      <w:r>
+        <w:t xml:space="preserve"> daily spend, per-SDA budgets with overrun findings, idle-resource detection and rightsizing surface problems before the bill does.</w:t>
       </w:r>
     </w:p>
     <w:p>
@@ -309,10 +305,10 @@
           <w:b/>
           <w:bCs/>
         </w:rPr>
-        <w:t xml:space="preserve">Reduced toil: </w:t>
-      </w:r>
-      <w:r>
-        <w:t xml:space="preserve">safe auto-remediation and AI-generated insights replace hours of manual reporting and follow-up.</w:t>
+        <w:t xml:space="preserve">Less toil, grounded AI:</w:t>
+      </w:r>
+      <w:r>
+        <w:t xml:space="preserve"> a daily digest and a remediation suggestion per finding replace manual reporting — each validated against platform data, with people making every change.</w:t>
       </w:r>
     </w:p>
     <w:p>
@@ -324,10 +320,94 @@
           <w:b/>
           <w:bCs/>
         </w:rPr>
-        <w:t xml:space="preserve">Measurable outcomes targeted: </w:t>
-      </w:r>
-      <w:r>
-        <w:t xml:space="preserve">tag-compliance percentage up, mean time-to-remediate findings down, and monthly spend on unused resources identified and recovered.</w:t>
+        <w:t xml:space="preserve">Measurable outcomes targeted:</w:t>
+      </w:r>
+      <w:r>
+        <w:t xml:space="preserve"> tag-compliance percentage up, mean time-to-resolve findings down, and spend on idle resources identified.</w:t>
+      </w:r>
+    </w:p>
+    <w:p>
+      <w:pPr>
+        <w:pStyle w:val="Heading1"/>
+        <w:spacing w:after="160" w:before="360"/>
+      </w:pPr>
+      <w:r>
+        <w:rPr>
+          <w:color w:val="16213E"/>
+        </w:rPr>
+        <w:t xml:space="preserve">How It Was Built</w:t>
+      </w:r>
+    </w:p>
+    <w:p>
+      <w:pPr>
+        <w:spacing w:after="140" w:line="300"/>
+      </w:pPr>
+      <w:r>
+        <w:t xml:space="preserve">One maintainer, working with Claude Code under GitHub Spec Kit: a constitution of eight principles, six feature specs taken from specification through plan and tasks, 481 tasks implemented on short-lived branches and merged through 149 pull requests behind 16 required CI checks — including a recorded AI constitution review on every pull request.</w:t>
+      </w:r>
+    </w:p>
+    <w:p>
+      <w:pPr>
+        <w:pStyle w:val="Heading1"/>
+        <w:spacing w:after="160" w:before="360"/>
+      </w:pPr>
+      <w:r>
+        <w:rPr>
+          <w:color w:val="16213E"/>
+        </w:rPr>
+        <w:t xml:space="preserve">Status (October 2026)</w:t>
+      </w:r>
+    </w:p>
+    <w:p>
+      <w:pPr>
+        <w:pStyle w:val="ListParagraph"/>
+        <w:numPr>
+          <w:ilvl w:val="0"/>
+          <w:numId w:val="2"/>
+        </w:numPr>
+        <w:spacing w:after="80" w:line="280"/>
+      </w:pPr>
+      <w:r>
+        <w:t xml:space="preserve">All six specs implemented; 481 of 481 tasks closed.</w:t>
+      </w:r>
+    </w:p>
+    <w:p>
+      <w:pPr>
+        <w:pStyle w:val="ListParagraph"/>
+        <w:numPr>
+          <w:ilvl w:val="0"/>
+          <w:numId w:val="2"/>
+        </w:numPr>
+        <w:spacing w:after="80" w:line="280"/>
+      </w:pPr>
+      <w:r>
+        <w:t xml:space="preserve">Live-verified end to end on a real AWS account: registration, a whole-account scan (87 resources), compliance scoring, CloudTrail ownership, the dashboard, the AI digest and suggestions through Nova, and cost ingestion — three bugs were found live and fixed.</w:t>
+      </w:r>
+    </w:p>
+    <w:p>
+      <w:pPr>
+        <w:pStyle w:val="ListParagraph"/>
+        <w:numPr>
+          <w:ilvl w:val="0"/>
+          <w:numId w:val="2"/>
+        </w:numPr>
+        <w:spacing w:after="80" w:line="280"/>
+      </w:pPr>
+      <w:r>
+        <w:t xml:space="preserve">Not yet live-verified: owner email (needs a verified SES sender) and cross-account onboarding (needs a second AWS account).</w:t>
+      </w:r>
+    </w:p>
+    <w:p>
+      <w:pPr>
+        <w:pStyle w:val="ListParagraph"/>
+        <w:numPr>
+          <w:ilvl w:val="0"/>
+          <w:numId w:val="2"/>
+        </w:numPr>
+        <w:spacing w:after="80" w:line="280"/>
+      </w:pPr>
+      <w:r>
+        <w:t xml:space="preserve">One environment, deployed for a working session and torn down to zero cost afterwards.</w:t>
       </w:r>
     </w:p>
     <w:sectPr>

</xml_diff>